<commit_message>
start to intigrate ADC with exist sensors
</commit_message>
<xml_diff>
--- a/doc/esp32-smart-irrigate.docx
+++ b/doc/esp32-smart-irrigate.docx
@@ -60,6 +60,10 @@
     <w:p>
       <w:pPr>
         <w:pStyle w:val="Heading1"/>
+        <w:numPr>
+          <w:ilvl w:val="0"/>
+          <w:numId w:val="1"/>
+        </w:numPr>
         <w:rPr>
           <w:rFonts w:ascii="Google Sans;sans-serif" w:hAnsi="Google Sans;sans-serif"/>
           <w:b/>
@@ -295,6 +299,10 @@
     <w:p>
       <w:pPr>
         <w:pStyle w:val="Heading1"/>
+        <w:numPr>
+          <w:ilvl w:val="0"/>
+          <w:numId w:val="1"/>
+        </w:numPr>
         <w:rPr>
           <w:rFonts w:ascii="Google Sans;sans-serif" w:hAnsi="Google Sans;sans-serif"/>
           <w:b/>
@@ -330,7 +338,15 @@
         </w:rPr>
       </w:pPr>
       <w:r>
-        <w:rPr/>
+        <w:rPr>
+          <w:rFonts w:ascii="Google Sans;sans-serif" w:hAnsi="Google Sans;sans-serif"/>
+          <w:b/>
+          <w:strike w:val="false"/>
+          <w:dstrike w:val="false"/>
+          <w:sz w:val="30"/>
+          <w:u w:val="none"/>
+          <w:effect w:val="none"/>
+        </w:rPr>
       </w:r>
     </w:p>
     <w:p>
@@ -1192,6 +1208,10 @@
     <w:p>
       <w:pPr>
         <w:pStyle w:val="Heading1"/>
+        <w:numPr>
+          <w:ilvl w:val="0"/>
+          <w:numId w:val="1"/>
+        </w:numPr>
         <w:rPr>
           <w:rFonts w:ascii="Google Sans;sans-serif" w:hAnsi="Google Sans;sans-serif"/>
           <w:b/>
@@ -1211,6 +1231,10 @@
     <w:p>
       <w:pPr>
         <w:pStyle w:val="Heading2"/>
+        <w:numPr>
+          <w:ilvl w:val="1"/>
+          <w:numId w:val="1"/>
+        </w:numPr>
         <w:rPr>
           <w:rFonts w:ascii="Google Sans;sans-serif" w:hAnsi="Google Sans;sans-serif"/>
           <w:b/>
@@ -1529,6 +1553,10 @@
     <w:p>
       <w:pPr>
         <w:pStyle w:val="Heading2"/>
+        <w:numPr>
+          <w:ilvl w:val="1"/>
+          <w:numId w:val="1"/>
+        </w:numPr>
         <w:rPr>
           <w:rFonts w:ascii="Google Sans;sans-serif" w:hAnsi="Google Sans;sans-serif"/>
           <w:b/>
@@ -1684,6 +1712,10 @@
     <w:p>
       <w:pPr>
         <w:pStyle w:val="Heading2"/>
+        <w:numPr>
+          <w:ilvl w:val="1"/>
+          <w:numId w:val="1"/>
+        </w:numPr>
         <w:rPr>
           <w:rFonts w:ascii="Google Sans;sans-serif" w:hAnsi="Google Sans;sans-serif"/>
           <w:b/>
@@ -1958,6 +1990,10 @@
     <w:p>
       <w:pPr>
         <w:pStyle w:val="Heading1"/>
+        <w:numPr>
+          <w:ilvl w:val="0"/>
+          <w:numId w:val="1"/>
+        </w:numPr>
         <w:rPr>
           <w:rFonts w:ascii="Google Sans;sans-serif" w:hAnsi="Google Sans;sans-serif"/>
           <w:b/>
@@ -1977,6 +2013,10 @@
     <w:p>
       <w:pPr>
         <w:pStyle w:val="Heading2"/>
+        <w:numPr>
+          <w:ilvl w:val="1"/>
+          <w:numId w:val="1"/>
+        </w:numPr>
         <w:rPr>
           <w:rFonts w:ascii="Google Sans;sans-serif" w:hAnsi="Google Sans;sans-serif"/>
           <w:b/>
@@ -2579,7 +2619,33 @@
           <w:u w:val="none"/>
           <w:effect w:val="none"/>
         </w:rPr>
-        <w:t>XDB401 Pressure Transmitter (GPIO 0):</w:t>
+        <w:t xml:space="preserve">XDB401 Pressure Transmitter (GPIO </w:t>
+      </w:r>
+      <w:r>
+        <w:rPr>
+          <w:rStyle w:val="Emphasis"/>
+          <w:rFonts w:ascii="Google Sans;sans-serif" w:hAnsi="Google Sans;sans-serif"/>
+          <w:b w:val="false"/>
+          <w:strike w:val="false"/>
+          <w:dstrike w:val="false"/>
+          <w:sz w:val="24"/>
+          <w:u w:val="none"/>
+          <w:effect w:val="none"/>
+        </w:rPr>
+        <w:t>2</w:t>
+      </w:r>
+      <w:r>
+        <w:rPr>
+          <w:rStyle w:val="Emphasis"/>
+          <w:rFonts w:ascii="Google Sans;sans-serif" w:hAnsi="Google Sans;sans-serif"/>
+          <w:b w:val="false"/>
+          <w:strike w:val="false"/>
+          <w:dstrike w:val="false"/>
+          <w:sz w:val="24"/>
+          <w:u w:val="none"/>
+          <w:effect w:val="none"/>
+        </w:rPr>
+        <w:t>):</w:t>
       </w:r>
       <w:r>
         <w:rPr>
@@ -2592,6 +2658,18 @@
           <w:effect w:val="none"/>
         </w:rPr>
         <w:t xml:space="preserve"> Interfaced directly to the primary analog channel. It records real-time water line pressure values, using hardware conditioning to scale raw output signals down to fit within safe internal limits.</w:t>
+      </w:r>
+      <w:r>
+        <w:rPr>
+          <w:rFonts w:ascii="Google Sans;sans-serif" w:hAnsi="Google Sans;sans-serif"/>
+          <w:b w:val="false"/>
+          <w:strike w:val="false"/>
+          <w:dstrike w:val="false"/>
+          <w:sz w:val="24"/>
+          <w:u w:val="none"/>
+          <w:effect w:val="none"/>
+        </w:rPr>
+        <w:t>(ADC1_CH2)</w:t>
       </w:r>
     </w:p>
     <w:p>
@@ -2624,7 +2702,33 @@
           <w:u w:val="none"/>
           <w:effect w:val="none"/>
         </w:rPr>
-        <w:t>Analog Wind Speed Sensor (GPIO 1):</w:t>
+        <w:t xml:space="preserve">Analog Wind Speed Sensor (GPIO </w:t>
+      </w:r>
+      <w:r>
+        <w:rPr>
+          <w:rStyle w:val="Emphasis"/>
+          <w:rFonts w:ascii="Google Sans;sans-serif" w:hAnsi="Google Sans;sans-serif"/>
+          <w:b w:val="false"/>
+          <w:strike w:val="false"/>
+          <w:dstrike w:val="false"/>
+          <w:sz w:val="24"/>
+          <w:u w:val="none"/>
+          <w:effect w:val="none"/>
+        </w:rPr>
+        <w:t>3</w:t>
+      </w:r>
+      <w:r>
+        <w:rPr>
+          <w:rStyle w:val="Emphasis"/>
+          <w:rFonts w:ascii="Google Sans;sans-serif" w:hAnsi="Google Sans;sans-serif"/>
+          <w:b w:val="false"/>
+          <w:strike w:val="false"/>
+          <w:dstrike w:val="false"/>
+          <w:sz w:val="24"/>
+          <w:u w:val="none"/>
+          <w:effect w:val="none"/>
+        </w:rPr>
+        <w:t>):</w:t>
       </w:r>
       <w:r>
         <w:rPr>
@@ -2637,6 +2741,18 @@
           <w:effect w:val="none"/>
         </w:rPr>
         <w:t xml:space="preserve"> Interfaced directly to the secondary analog channel. Because the sensor outputs a 0–5V range, an external voltage divider circuit steps the incoming voltage down to a safe, readable level. The software maps this reading back to the true 0.0–30.0 meters per second wind speed curve.</w:t>
+      </w:r>
+      <w:r>
+        <w:rPr>
+          <w:rFonts w:ascii="Google Sans;sans-serif" w:hAnsi="Google Sans;sans-serif"/>
+          <w:b w:val="false"/>
+          <w:strike w:val="false"/>
+          <w:dstrike w:val="false"/>
+          <w:sz w:val="24"/>
+          <w:u w:val="none"/>
+          <w:effect w:val="none"/>
+        </w:rPr>
+        <w:t>(ADC1_CH3)</w:t>
       </w:r>
     </w:p>
     <w:p>
@@ -2687,6 +2803,10 @@
     <w:p>
       <w:pPr>
         <w:pStyle w:val="Heading2"/>
+        <w:numPr>
+          <w:ilvl w:val="1"/>
+          <w:numId w:val="1"/>
+        </w:numPr>
         <w:rPr>
           <w:rFonts w:ascii="Google Sans;sans-serif" w:hAnsi="Google Sans;sans-serif"/>
           <w:b/>
@@ -3025,6 +3145,10 @@
     <w:p>
       <w:pPr>
         <w:pStyle w:val="Heading2"/>
+        <w:numPr>
+          <w:ilvl w:val="1"/>
+          <w:numId w:val="1"/>
+        </w:numPr>
         <w:rPr>
           <w:rFonts w:ascii="Google Sans;sans-serif" w:hAnsi="Google Sans;sans-serif"/>
           <w:b/>
@@ -3287,7 +3411,6 @@
   <w:abstractNum w:abstractNumId="1">
     <w:lvl w:ilvl="0">
       <w:start w:val="1"/>
-      <w:pStyle w:val="Heading1"/>
       <w:numFmt w:val="none"/>
       <w:suff w:val="nothing"/>
       <w:lvlText w:val=""/>
@@ -3298,10 +3421,10 @@
         </w:tabs>
         <w:ind w:left="0" w:hanging="0"/>
       </w:pPr>
+      <w:rPr/>
     </w:lvl>
     <w:lvl w:ilvl="1">
       <w:start w:val="1"/>
-      <w:pStyle w:val="Heading2"/>
       <w:numFmt w:val="none"/>
       <w:suff w:val="nothing"/>
       <w:lvlText w:val=""/>
@@ -3312,6 +3435,7 @@
         </w:tabs>
         <w:ind w:left="0" w:hanging="0"/>
       </w:pPr>
+      <w:rPr/>
     </w:lvl>
     <w:lvl w:ilvl="2">
       <w:start w:val="1"/>
@@ -3325,6 +3449,7 @@
         </w:tabs>
         <w:ind w:left="0" w:hanging="0"/>
       </w:pPr>
+      <w:rPr/>
     </w:lvl>
     <w:lvl w:ilvl="3">
       <w:start w:val="1"/>
@@ -3338,6 +3463,7 @@
         </w:tabs>
         <w:ind w:left="0" w:hanging="0"/>
       </w:pPr>
+      <w:rPr/>
     </w:lvl>
     <w:lvl w:ilvl="4">
       <w:start w:val="1"/>
@@ -3351,6 +3477,7 @@
         </w:tabs>
         <w:ind w:left="0" w:hanging="0"/>
       </w:pPr>
+      <w:rPr/>
     </w:lvl>
     <w:lvl w:ilvl="5">
       <w:start w:val="1"/>
@@ -3364,6 +3491,7 @@
         </w:tabs>
         <w:ind w:left="0" w:hanging="0"/>
       </w:pPr>
+      <w:rPr/>
     </w:lvl>
     <w:lvl w:ilvl="6">
       <w:start w:val="1"/>
@@ -3377,6 +3505,7 @@
         </w:tabs>
         <w:ind w:left="0" w:hanging="0"/>
       </w:pPr>
+      <w:rPr/>
     </w:lvl>
     <w:lvl w:ilvl="7">
       <w:start w:val="1"/>
@@ -3390,6 +3519,7 @@
         </w:tabs>
         <w:ind w:left="0" w:hanging="0"/>
       </w:pPr>
+      <w:rPr/>
     </w:lvl>
     <w:lvl w:ilvl="8">
       <w:start w:val="1"/>
@@ -3403,6 +3533,7 @@
         </w:tabs>
         <w:ind w:left="0" w:hanging="0"/>
       </w:pPr>
+      <w:rPr/>
     </w:lvl>
   </w:abstractNum>
   <w:abstractNum w:abstractNumId="2">
@@ -4362,6 +4493,125 @@
       <w:rPr>
         <w:rFonts w:ascii="OpenSymbol" w:hAnsi="OpenSymbol" w:cs="OpenSymbol" w:hint="default"/>
       </w:rPr>
+    </w:lvl>
+  </w:abstractNum>
+  <w:abstractNum w:abstractNumId="9">
+    <w:lvl w:ilvl="0">
+      <w:start w:val="1"/>
+      <w:numFmt w:val="none"/>
+      <w:suff w:val="nothing"/>
+      <w:lvlText w:val=""/>
+      <w:lvlJc w:val="left"/>
+      <w:pPr>
+        <w:tabs>
+          <w:tab w:val="num" w:pos="0"/>
+        </w:tabs>
+        <w:ind w:left="0" w:hanging="0"/>
+      </w:pPr>
+    </w:lvl>
+    <w:lvl w:ilvl="1">
+      <w:start w:val="1"/>
+      <w:numFmt w:val="none"/>
+      <w:suff w:val="nothing"/>
+      <w:lvlText w:val=""/>
+      <w:lvlJc w:val="left"/>
+      <w:pPr>
+        <w:tabs>
+          <w:tab w:val="num" w:pos="0"/>
+        </w:tabs>
+        <w:ind w:left="0" w:hanging="0"/>
+      </w:pPr>
+    </w:lvl>
+    <w:lvl w:ilvl="2">
+      <w:start w:val="1"/>
+      <w:numFmt w:val="none"/>
+      <w:suff w:val="nothing"/>
+      <w:lvlText w:val=""/>
+      <w:lvlJc w:val="left"/>
+      <w:pPr>
+        <w:tabs>
+          <w:tab w:val="num" w:pos="0"/>
+        </w:tabs>
+        <w:ind w:left="0" w:hanging="0"/>
+      </w:pPr>
+    </w:lvl>
+    <w:lvl w:ilvl="3">
+      <w:start w:val="1"/>
+      <w:numFmt w:val="none"/>
+      <w:suff w:val="nothing"/>
+      <w:lvlText w:val=""/>
+      <w:lvlJc w:val="left"/>
+      <w:pPr>
+        <w:tabs>
+          <w:tab w:val="num" w:pos="0"/>
+        </w:tabs>
+        <w:ind w:left="0" w:hanging="0"/>
+      </w:pPr>
+    </w:lvl>
+    <w:lvl w:ilvl="4">
+      <w:start w:val="1"/>
+      <w:numFmt w:val="none"/>
+      <w:suff w:val="nothing"/>
+      <w:lvlText w:val=""/>
+      <w:lvlJc w:val="left"/>
+      <w:pPr>
+        <w:tabs>
+          <w:tab w:val="num" w:pos="0"/>
+        </w:tabs>
+        <w:ind w:left="0" w:hanging="0"/>
+      </w:pPr>
+    </w:lvl>
+    <w:lvl w:ilvl="5">
+      <w:start w:val="1"/>
+      <w:numFmt w:val="none"/>
+      <w:suff w:val="nothing"/>
+      <w:lvlText w:val=""/>
+      <w:lvlJc w:val="left"/>
+      <w:pPr>
+        <w:tabs>
+          <w:tab w:val="num" w:pos="0"/>
+        </w:tabs>
+        <w:ind w:left="0" w:hanging="0"/>
+      </w:pPr>
+    </w:lvl>
+    <w:lvl w:ilvl="6">
+      <w:start w:val="1"/>
+      <w:numFmt w:val="none"/>
+      <w:suff w:val="nothing"/>
+      <w:lvlText w:val=""/>
+      <w:lvlJc w:val="left"/>
+      <w:pPr>
+        <w:tabs>
+          <w:tab w:val="num" w:pos="0"/>
+        </w:tabs>
+        <w:ind w:left="0" w:hanging="0"/>
+      </w:pPr>
+    </w:lvl>
+    <w:lvl w:ilvl="7">
+      <w:start w:val="1"/>
+      <w:numFmt w:val="none"/>
+      <w:suff w:val="nothing"/>
+      <w:lvlText w:val=""/>
+      <w:lvlJc w:val="left"/>
+      <w:pPr>
+        <w:tabs>
+          <w:tab w:val="num" w:pos="0"/>
+        </w:tabs>
+        <w:ind w:left="0" w:hanging="0"/>
+      </w:pPr>
+    </w:lvl>
+    <w:lvl w:ilvl="8">
+      <w:start w:val="1"/>
+      <w:numFmt w:val="none"/>
+      <w:suff w:val="nothing"/>
+      <w:lvlText w:val=""/>
+      <w:lvlJc w:val="left"/>
+      <w:pPr>
+        <w:tabs>
+          <w:tab w:val="num" w:pos="0"/>
+        </w:tabs>
+        <w:ind w:left="0" w:hanging="0"/>
+      </w:pPr>
     </w:lvl>
   </w:abstractNum>
   <w:num w:numId="1">
@@ -4387,6 +4637,9 @@
   </w:num>
   <w:num w:numId="8">
     <w:abstractNumId w:val="8"/>
+  </w:num>
+  <w:num w:numId="9">
+    <w:abstractNumId w:val="9"/>
   </w:num>
 </w:numbering>
 </file>

</xml_diff>